<commit_message>
Refactor: generic Data Exchange purchase import handler
- Rename EDocPEPPOLDXHandler → EDocDataExchPurchHandler (codeunit 6407
  "E-Doc. DataExch. Purch Handler") — handler is now format-agnostic
- Rename enum value to "Data Exchange Purchase" with updated caption
- FindBestDataExchDef: replace hardcoded PEPPOL namespace/def-code constants
  with a lookup against EDocServiceDataExchDef, matching document namespace
  to DataExchLineDef.Namespace — any format works without code changes
- EDocPEPPOLDXPostMapping (6408): replace direct EDocumentPurchaseLine inserts
  with WriteChargeLinesToIntermediate — charge lines are written into
  Intermediate Data Import with Record Nos. above invoice lines so the generic
  MapIntermediateToLines bridge processes them in correct order
- Register codeunit 6408 as PostMappingCodeunit in both V2 XML definitions

Co-Authored-By: Claude Sonnet 4.6 (1M context) <noreply@anthropic.com>
</commit_message>
<xml_diff>
--- a/src/Apps/W1/EDocument/App/src/SampleInvoice/EDocSamplePurchInvoice3.docx
+++ b/src/Apps/W1/EDocument/App/src/SampleInvoice/EDocSamplePurchInvoice3.docx
@@ -614,12 +614,12 @@
         <w:tblStyle w:val="TableGrid"/>
         <w:tblW w:w="0" w:type="auto"/>
         <w:tblBorders>
-          <w:top w:val="none" w:sz="0" w:space="0" w:color="auto"/>
-          <w:left w:val="none" w:sz="0" w:space="0" w:color="auto"/>
-          <w:bottom w:val="none" w:sz="0" w:space="0" w:color="auto"/>
-          <w:right w:val="none" w:sz="0" w:space="0" w:color="auto"/>
-          <w:insideH w:val="none" w:sz="0" w:space="0" w:color="auto"/>
-          <w:insideV w:val="none" w:sz="0" w:space="0" w:color="auto"/>
+          <w:top w:val="none" w:color="auto" w:sz="0" w:space="0"/>
+          <w:left w:val="none" w:color="auto" w:sz="0" w:space="0"/>
+          <w:bottom w:val="none" w:color="auto" w:sz="0" w:space="0"/>
+          <w:right w:val="none" w:color="auto" w:sz="0" w:space="0"/>
+          <w:insideH w:val="none" w:color="auto" w:sz="0" w:space="0"/>
+          <w:insideV w:val="none" w:color="auto" w:sz="0" w:space="0"/>
         </w:tblBorders>
         <w:tblLayout w:type="fixed"/>
         <w:tblCellMar>
@@ -2160,12 +2160,12 @@
       <w:tblW w:w="5000" w:type="pct"/>
       <w:tblCellSpacing w:w="11" w:type="dxa"/>
       <w:tblBorders>
-        <w:top w:val="none" w:sz="0" w:space="0" w:color="auto"/>
-        <w:left w:val="none" w:sz="0" w:space="0" w:color="auto"/>
-        <w:bottom w:val="none" w:sz="0" w:space="0" w:color="auto"/>
-        <w:right w:val="none" w:sz="0" w:space="0" w:color="auto"/>
-        <w:insideH w:val="none" w:sz="0" w:space="0" w:color="auto"/>
-        <w:insideV w:val="none" w:sz="0" w:space="0" w:color="auto"/>
+        <w:top w:val="none" w:color="auto" w:sz="0" w:space="0"/>
+        <w:left w:val="none" w:color="auto" w:sz="0" w:space="0"/>
+        <w:bottom w:val="none" w:color="auto" w:sz="0" w:space="0"/>
+        <w:right w:val="none" w:color="auto" w:sz="0" w:space="0"/>
+        <w:insideH w:val="none" w:color="auto" w:sz="0" w:space="0"/>
+        <w:insideV w:val="none" w:color="auto" w:sz="0" w:space="0"/>
       </w:tblBorders>
       <w:tblCellMar>
         <w:left w:w="0" w:type="dxa"/>
@@ -2191,12 +2191,12 @@
             <w:tblStyle w:val="TableGrid"/>
             <w:tblW w:w="5000" w:type="pct"/>
             <w:tblBorders>
-              <w:top w:val="none" w:sz="0" w:space="0" w:color="auto"/>
-              <w:left w:val="none" w:sz="0" w:space="0" w:color="auto"/>
-              <w:bottom w:val="none" w:sz="0" w:space="0" w:color="auto"/>
-              <w:right w:val="none" w:sz="0" w:space="0" w:color="auto"/>
-              <w:insideH w:val="none" w:sz="0" w:space="0" w:color="auto"/>
-              <w:insideV w:val="none" w:sz="0" w:space="0" w:color="auto"/>
+              <w:top w:val="none" w:color="auto" w:sz="0" w:space="0"/>
+              <w:left w:val="none" w:color="auto" w:sz="0" w:space="0"/>
+              <w:bottom w:val="none" w:color="auto" w:sz="0" w:space="0"/>
+              <w:right w:val="none" w:color="auto" w:sz="0" w:space="0"/>
+              <w:insideH w:val="none" w:color="auto" w:sz="0" w:space="0"/>
+              <w:insideV w:val="none" w:color="auto" w:sz="0" w:space="0"/>
             </w:tblBorders>
             <w:tblCellMar>
               <w:left w:w="0" w:type="dxa"/>
@@ -2278,12 +2278,12 @@
       <w:tblStyle w:val="TableGrid"/>
       <w:tblW w:w="5000" w:type="pct"/>
       <w:tblBorders>
-        <w:top w:val="none" w:sz="0" w:space="0" w:color="auto"/>
-        <w:left w:val="none" w:sz="0" w:space="0" w:color="auto"/>
-        <w:bottom w:val="none" w:sz="0" w:space="0" w:color="auto"/>
-        <w:right w:val="none" w:sz="0" w:space="0" w:color="auto"/>
-        <w:insideH w:val="none" w:sz="0" w:space="0" w:color="auto"/>
-        <w:insideV w:val="none" w:sz="0" w:space="0" w:color="auto"/>
+        <w:top w:val="none" w:color="auto" w:sz="0" w:space="0"/>
+        <w:left w:val="none" w:color="auto" w:sz="0" w:space="0"/>
+        <w:bottom w:val="none" w:color="auto" w:sz="0" w:space="0"/>
+        <w:right w:val="none" w:color="auto" w:sz="0" w:space="0"/>
+        <w:insideH w:val="none" w:color="auto" w:sz="0" w:space="0"/>
+        <w:insideV w:val="none" w:color="auto" w:sz="0" w:space="0"/>
       </w:tblBorders>
       <w:tblLayout w:type="fixed"/>
       <w:tblCellMar>
@@ -2907,12 +2907,12 @@
       <w:tblStyle w:val="TableGrid"/>
       <w:tblW w:w="5000" w:type="pct"/>
       <w:tblBorders>
-        <w:top w:val="none" w:sz="0" w:space="0" w:color="auto"/>
-        <w:left w:val="none" w:sz="0" w:space="0" w:color="auto"/>
-        <w:bottom w:val="none" w:sz="0" w:space="0" w:color="auto"/>
-        <w:right w:val="none" w:sz="0" w:space="0" w:color="auto"/>
-        <w:insideH w:val="none" w:sz="0" w:space="0" w:color="auto"/>
-        <w:insideV w:val="none" w:sz="0" w:space="0" w:color="auto"/>
+        <w:top w:val="none" w:color="auto" w:sz="0" w:space="0"/>
+        <w:left w:val="none" w:color="auto" w:sz="0" w:space="0"/>
+        <w:bottom w:val="none" w:color="auto" w:sz="0" w:space="0"/>
+        <w:right w:val="none" w:color="auto" w:sz="0" w:space="0"/>
+        <w:insideH w:val="none" w:color="auto" w:sz="0" w:space="0"/>
+        <w:insideV w:val="none" w:color="auto" w:sz="0" w:space="0"/>
       </w:tblBorders>
       <w:tblCellMar>
         <w:left w:w="0" w:type="dxa"/>
@@ -3143,7 +3143,7 @@
 </file>
 
 <file path=word/header2.xml><?xml version="1.0" encoding="utf-8"?>
-<w:hdr xmlns:wpc="http://schemas.microsoft.com/office/word/2010/wordprocessingCanvas" xmlns:cx="http://schemas.microsoft.com/office/drawing/2014/chartex" xmlns:cx1="http://schemas.microsoft.com/office/drawing/2015/9/8/chartex" xmlns:cx2="http://schemas.microsoft.com/office/drawing/2015/10/21/chartex" xmlns:cx3="http://schemas.microsoft.com/office/drawing/2016/5/9/chartex" xmlns:cx4="http://schemas.microsoft.com/office/drawing/2016/5/10/chartex" xmlns:cx5="http://schemas.microsoft.com/office/drawing/2016/5/11/chartex" xmlns:cx6="http://schemas.microsoft.com/office/drawing/2016/5/12/chartex" xmlns:cx7="http://schemas.microsoft.com/office/drawing/2016/5/13/chartex" xmlns:cx8="http://schemas.microsoft.com/office/drawing/2016/5/14/chartex" xmlns:mc="http://schemas.openxmlformats.org/markup-compatibility/2006" xmlns:aink="http://schemas.microsoft.com/office/drawing/2016/ink" xmlns:am3d="http://schemas.microsoft.com/office/drawing/2017/model3d" xmlns:o="urn:schemas-microsoft-com:office:office" xmlns:oel="http://schemas.microsoft.com/office/2019/extlst" xmlns:r="http://schemas.openxmlformats.org/officeDocument/2006/relationships" xmlns:m="http://schemas.openxmlformats.org/officeDocument/2006/math" xmlns:v="urn:schemas-microsoft-com:vml" xmlns:wp14="http://schemas.microsoft.com/office/word/2010/wordprocessingDrawing" xmlns:wp="http://schemas.openxmlformats.org/drawingml/2006/wordprocessingDrawing" xmlns:w10="urn:schemas-microsoft-com:office:word" xmlns:w="http://schemas.openxmlformats.org/wordprocessingml/2006/main" xmlns:w14="http://schemas.microsoft.com/office/word/2010/wordml" xmlns:w15="http://schemas.microsoft.com/office/word/2012/wordml" xmlns:w16cex="http://schemas.microsoft.com/office/word/2018/wordml/cex" xmlns:w16cid="http://schemas.microsoft.com/office/word/2016/wordml/cid" xmlns:w16="http://schemas.microsoft.com/office/word/2018/wordml" xmlns:w16du="http://schemas.microsoft.com/office/word/2023/wordml/word16du" xmlns:w16sdtdh="http://schemas.microsoft.com/office/word/2020/wordml/sdtdatahash" xmlns:w16sdtfl="http://schemas.microsoft.com/office/word/2024/wordml/sdtformatlock" xmlns:w16se="http://schemas.microsoft.com/office/word/2015/wordml/symex" xmlns:wpg="http://schemas.microsoft.com/office/word/2010/wordprocessingGroup" xmlns:wpi="http://schemas.microsoft.com/office/word/2010/wordprocessingInk" xmlns:wne="http://schemas.microsoft.com/office/word/2006/wordml" xmlns:wps="http://schemas.microsoft.com/office/word/2010/wordprocessingShape" mc:Ignorable="w14 w15 w16se w16cid w16 w16cex w16sdtdh w16sdtfl w16du wp14">
+<w:hdr xmlns:a="http://schemas.openxmlformats.org/drawingml/2006/main" xmlns:wpc="http://schemas.microsoft.com/office/word/2010/wordprocessingCanvas" xmlns:cx="http://schemas.microsoft.com/office/drawing/2014/chartex" xmlns:cx1="http://schemas.microsoft.com/office/drawing/2015/9/8/chartex" xmlns:cx2="http://schemas.microsoft.com/office/drawing/2015/10/21/chartex" xmlns:cx3="http://schemas.microsoft.com/office/drawing/2016/5/9/chartex" xmlns:cx4="http://schemas.microsoft.com/office/drawing/2016/5/10/chartex" xmlns:cx5="http://schemas.microsoft.com/office/drawing/2016/5/11/chartex" xmlns:cx6="http://schemas.microsoft.com/office/drawing/2016/5/12/chartex" xmlns:cx7="http://schemas.microsoft.com/office/drawing/2016/5/13/chartex" xmlns:cx8="http://schemas.microsoft.com/office/drawing/2016/5/14/chartex" xmlns:mc="http://schemas.openxmlformats.org/markup-compatibility/2006" xmlns:aink="http://schemas.microsoft.com/office/drawing/2016/ink" xmlns:am3d="http://schemas.microsoft.com/office/drawing/2017/model3d" xmlns:o="urn:schemas-microsoft-com:office:office" xmlns:oel="http://schemas.microsoft.com/office/2019/extlst" xmlns:r="http://schemas.openxmlformats.org/officeDocument/2006/relationships" xmlns:m="http://schemas.openxmlformats.org/officeDocument/2006/math" xmlns:v="urn:schemas-microsoft-com:vml" xmlns:wp14="http://schemas.microsoft.com/office/word/2010/wordprocessingDrawing" xmlns:wp="http://schemas.openxmlformats.org/drawingml/2006/wordprocessingDrawing" xmlns:w10="urn:schemas-microsoft-com:office:word" xmlns:w="http://schemas.openxmlformats.org/wordprocessingml/2006/main" xmlns:w14="http://schemas.microsoft.com/office/word/2010/wordml" xmlns:w15="http://schemas.microsoft.com/office/word/2012/wordml" xmlns:w16cex="http://schemas.microsoft.com/office/word/2018/wordml/cex" xmlns:w16cid="http://schemas.microsoft.com/office/word/2016/wordml/cid" xmlns:w16="http://schemas.microsoft.com/office/word/2018/wordml" xmlns:w16du="http://schemas.microsoft.com/office/word/2023/wordml/word16du" xmlns:w16sdtdh="http://schemas.microsoft.com/office/word/2020/wordml/sdtdatahash" xmlns:w16sdtfl="http://schemas.microsoft.com/office/word/2024/wordml/sdtformatlock" xmlns:w16se="http://schemas.microsoft.com/office/word/2015/wordml/symex" xmlns:wpg="http://schemas.microsoft.com/office/word/2010/wordprocessingGroup" xmlns:wpi="http://schemas.microsoft.com/office/word/2010/wordprocessingInk" xmlns:wne="http://schemas.microsoft.com/office/word/2006/wordml" xmlns:wps="http://schemas.microsoft.com/office/word/2010/wordprocessingShape" mc:Ignorable="w14 w15 w16se w16cid w16 w16cex w16sdtdh w16sdtfl w16du wp14">
   <w:p>
     <w:pPr>
       <w:pStyle w:val="Header"/>
@@ -3157,7 +3157,7 @@
       <mc:AlternateContent>
         <mc:Choice Requires="wps">
           <w:drawing>
-            <wp:anchor distT="0" distB="0" distL="118745" distR="118745" simplePos="0" relativeHeight="251659264" behindDoc="1" locked="0" layoutInCell="1" allowOverlap="0" wp14:anchorId="14B8DDE3" wp14:editId="3847F1EE">
+            <wp:anchor distT="0" distB="0" distL="118745" distR="118745" simplePos="0" relativeHeight="251659264" behindDoc="1" locked="0" layoutInCell="1" allowOverlap="0" wp14:editId="3847F1EE" wp14:anchorId="14B8DDE3">
               <wp:simplePos x="0" y="0"/>
               <wp:positionH relativeFrom="margin">
                 <wp:align>center</wp:align>
@@ -3228,6 +3228,8 @@
                             </w:placeholder>
                             <w:dataBinding w:prefixMappings="xmlns:ns0='urn:microsoft-dynamics-nav/reports/E_Doc_Sample_Purchase_Invoice/6102/' " w:xpath="/ns0:NavWordReportXmlPart[1]/ns0:Header[1]/ns0:InvoiceCaption[1]" w:storeItemID="{77DCDA3D-DC37-4B69-A105-295A851BE58A}"/>
                             <w:text/>
+                            <w:alias w:val="#Nav: /Header/InvoiceCaption"/>
+                            <w:tag w:val="#Nav: E_Doc_Sample_Purchase_Invoice/6102"/>
                           </w:sdtPr>
                           <w:sdtContent>
                             <w:p>
@@ -3277,7 +3279,7 @@
         </mc:Choice>
         <mc:Fallback>
           <w:pict>
-            <v:rect w14:anchorId="14B8DDE3" id="Rectangle 200" o:spid="_x0000_s1026" style="position:absolute;margin-left:0;margin-top:0;width:468.5pt;height:21.3pt;z-index:-251657216;visibility:visible;mso-wrap-style:square;mso-width-percent:1000;mso-height-percent:27;mso-top-percent:45;mso-wrap-distance-left:9.35pt;mso-wrap-distance-top:0;mso-wrap-distance-right:9.35pt;mso-wrap-distance-bottom:0;mso-position-horizontal:center;mso-position-horizontal-relative:margin;mso-position-vertical-relative:page;mso-width-percent:1000;mso-height-percent:27;mso-top-percent:45;mso-width-relative:margin;mso-height-relative:page;v-text-anchor:middle" o:gfxdata="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" o:allowoverlap="f" fillcolor="#ed7d31 [3205]" stroked="f">
+            <v:rect id="Rectangle 200" style="position:absolute;margin-left:0;margin-top:0;width:468.5pt;height:21.3pt;z-index:-251657216;visibility:visible;mso-wrap-style:square;mso-width-percent:1000;mso-height-percent:27;mso-top-percent:45;mso-wrap-distance-left:9.35pt;mso-wrap-distance-top:0;mso-wrap-distance-right:9.35pt;mso-wrap-distance-bottom:0;mso-position-horizontal:center;mso-position-horizontal-relative:margin;mso-position-vertical-relative:page;mso-width-percent:1000;mso-height-percent:27;mso-top-percent:45;mso-width-relative:margin;mso-height-relative:page;v-text-anchor:middle" o:spid="_x0000_s1026" o:allowoverlap="f" fillcolor="#ed7d31 [3205]" stroked="f" o:gfxdata="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" w14:anchorId="14B8DDE3">
               <v:textbox style="mso-fit-shape-to-text:t">
                 <w:txbxContent>
                   <w:sdt>
@@ -3294,6 +3296,8 @@
                       </w:placeholder>
                       <w:dataBinding w:prefixMappings="xmlns:ns0='urn:microsoft-dynamics-nav/reports/E_Doc_Sample_Purchase_Invoice/6102/' " w:xpath="/ns0:NavWordReportXmlPart[1]/ns0:Header[1]/ns0:InvoiceCaption[1]" w:storeItemID="{77DCDA3D-DC37-4B69-A105-295A851BE58A}"/>
                       <w:text/>
+                      <w:alias w:val="#Nav: /Header/InvoiceCaption"/>
+                      <w:tag w:val="#Nav: E_Doc_Sample_Purchase_Invoice/6102"/>
                     </w:sdtPr>
                     <w:sdtContent>
                       <w:p>

</xml_diff>